<commit_message>
Project executable file update
</commit_message>
<xml_diff>
--- a/7. Project Documentation/Project Executable Files.docx
+++ b/7. Project Documentation/Project Executable Files.docx
@@ -237,11 +237,19 @@
             <w:pPr>
               <w:ind w:left="14"/>
             </w:pPr>
-            <w:r>
-              <w:rPr>
-                <w:rFonts w:ascii="Times New Roman" w:eastAsia="Times New Roman" w:hAnsi="Times New Roman" w:cs="Times New Roman"/>
-              </w:rPr>
-              <w:t xml:space="preserve">OptiCrop: Smart Agricultural Production Optimization Engine </w:t>
+            <w:proofErr w:type="spellStart"/>
+            <w:r>
+              <w:rPr>
+                <w:rFonts w:ascii="Times New Roman" w:eastAsia="Times New Roman" w:hAnsi="Times New Roman" w:cs="Times New Roman"/>
+              </w:rPr>
+              <w:t>OptiCrop</w:t>
+            </w:r>
+            <w:proofErr w:type="spellEnd"/>
+            <w:r>
+              <w:rPr>
+                <w:rFonts w:ascii="Times New Roman" w:eastAsia="Times New Roman" w:hAnsi="Times New Roman" w:cs="Times New Roman"/>
+              </w:rPr>
+              <w:t xml:space="preserve">: Smart Agricultural Production Optimization Engine </w:t>
             </w:r>
           </w:p>
         </w:tc>
@@ -358,7 +366,25 @@
           <w:sz w:val="44"/>
           <w:szCs w:val="44"/>
         </w:rPr>
-        <w:t xml:space="preserve">This section requires submission of all executable and deployable files for your project. Ensure all files are properly organized, named, and uploaded to the specified submission platform.The evaluator must be able to run or deploy your solution using the provided files and instructions. </w:t>
+        <w:t xml:space="preserve">This section requires submission of all executable and deployable files for your project. Ensure all files are properly organized, named, and uploaded to the specified submission </w:t>
+      </w:r>
+      <w:proofErr w:type="spellStart"/>
+      <w:r>
+        <w:rPr>
+          <w:rFonts w:ascii="Arial" w:eastAsia="Arial" w:hAnsi="Arial" w:cs="Arial"/>
+          <w:sz w:val="44"/>
+          <w:szCs w:val="44"/>
+        </w:rPr>
+        <w:t>platform.The</w:t>
+      </w:r>
+      <w:proofErr w:type="spellEnd"/>
+      <w:r>
+        <w:rPr>
+          <w:rFonts w:ascii="Arial" w:eastAsia="Arial" w:hAnsi="Arial" w:cs="Arial"/>
+          <w:sz w:val="44"/>
+          <w:szCs w:val="44"/>
+        </w:rPr>
+        <w:t xml:space="preserve"> evaluator must be able to run or deploy your solution using the provided files and instructions. </w:t>
       </w:r>
       <w:r>
         <w:rPr>
@@ -427,13 +453,23 @@
             <w:pPr>
               <w:ind w:left="137"/>
             </w:pPr>
+            <w:proofErr w:type="spellStart"/>
             <w:r>
               <w:rPr>
                 <w:rFonts w:ascii="Arial" w:eastAsia="Arial" w:hAnsi="Arial" w:cs="Arial"/>
                 <w:b/>
                 <w:sz w:val="24"/>
               </w:rPr>
-              <w:t xml:space="preserve">S.No </w:t>
+              <w:t>S.No</w:t>
+            </w:r>
+            <w:proofErr w:type="spellEnd"/>
+            <w:r>
+              <w:rPr>
+                <w:rFonts w:ascii="Arial" w:eastAsia="Arial" w:hAnsi="Arial" w:cs="Arial"/>
+                <w:b/>
+                <w:sz w:val="24"/>
+              </w:rPr>
+              <w:t xml:space="preserve"> </w:t>
             </w:r>
             <w:r>
               <w:t xml:space="preserve"> </w:t>
@@ -816,7 +852,23 @@
                 <w:rFonts w:ascii="Arial" w:eastAsia="Arial" w:hAnsi="Arial" w:cs="Arial"/>
                 <w:sz w:val="24"/>
               </w:rPr>
-              <w:t xml:space="preserve">requirements.txt / package.json / dependency file </w:t>
+              <w:t xml:space="preserve">requirements.txt / </w:t>
+            </w:r>
+            <w:proofErr w:type="spellStart"/>
+            <w:r>
+              <w:rPr>
+                <w:rFonts w:ascii="Arial" w:eastAsia="Arial" w:hAnsi="Arial" w:cs="Arial"/>
+                <w:sz w:val="24"/>
+              </w:rPr>
+              <w:t>package.json</w:t>
+            </w:r>
+            <w:proofErr w:type="spellEnd"/>
+            <w:r>
+              <w:rPr>
+                <w:rFonts w:ascii="Arial" w:eastAsia="Arial" w:hAnsi="Arial" w:cs="Arial"/>
+                <w:sz w:val="24"/>
+              </w:rPr>
+              <w:t xml:space="preserve"> / dependency file </w:t>
             </w:r>
             <w:r>
               <w:t xml:space="preserve"> </w:t>
@@ -999,7 +1051,23 @@
                 <w:rFonts w:ascii="Times New Roman" w:eastAsia="Times New Roman" w:hAnsi="Times New Roman" w:cs="Times New Roman"/>
                 <w:sz w:val="24"/>
               </w:rPr>
-              <w:t>database used; CSV dataset + model.pkl file storage instead</w:t>
+              <w:t xml:space="preserve">database used; CSV dataset + </w:t>
+            </w:r>
+            <w:proofErr w:type="spellStart"/>
+            <w:r>
+              <w:rPr>
+                <w:rFonts w:ascii="Times New Roman" w:eastAsia="Times New Roman" w:hAnsi="Times New Roman" w:cs="Times New Roman"/>
+                <w:sz w:val="24"/>
+              </w:rPr>
+              <w:t>model.pkl</w:t>
+            </w:r>
+            <w:proofErr w:type="spellEnd"/>
+            <w:r>
+              <w:rPr>
+                <w:rFonts w:ascii="Times New Roman" w:eastAsia="Times New Roman" w:hAnsi="Times New Roman" w:cs="Times New Roman"/>
+                <w:sz w:val="24"/>
+              </w:rPr>
+              <w:t xml:space="preserve"> file storage instead</w:t>
             </w:r>
             <w:r>
               <w:t xml:space="preserve"> </w:t>
@@ -1074,7 +1142,23 @@
                 <w:rFonts w:ascii="Arial" w:eastAsia="Arial" w:hAnsi="Arial" w:cs="Arial"/>
                 <w:sz w:val="24"/>
               </w:rPr>
-              <w:t xml:space="preserve">Environment  configuration file (.env.example similar) </w:t>
+              <w:t>Environment  configuration file (.</w:t>
+            </w:r>
+            <w:proofErr w:type="spellStart"/>
+            <w:r>
+              <w:rPr>
+                <w:rFonts w:ascii="Arial" w:eastAsia="Arial" w:hAnsi="Arial" w:cs="Arial"/>
+                <w:sz w:val="24"/>
+              </w:rPr>
+              <w:t>env.example</w:t>
+            </w:r>
+            <w:proofErr w:type="spellEnd"/>
+            <w:r>
+              <w:rPr>
+                <w:rFonts w:ascii="Arial" w:eastAsia="Arial" w:hAnsi="Arial" w:cs="Arial"/>
+                <w:sz w:val="24"/>
+              </w:rPr>
+              <w:t xml:space="preserve"> similar) </w:t>
             </w:r>
             <w:r>
               <w:t xml:space="preserve"> </w:t>
@@ -1428,12 +1512,21 @@
                 <w:sz w:val="24"/>
               </w:rPr>
             </w:pPr>
-            <w:r>
-              <w:rPr>
-                <w:rFonts w:ascii="Arial" w:eastAsia="Arial" w:hAnsi="Arial" w:cs="Arial"/>
-                <w:sz w:val="24"/>
-              </w:rPr>
-              <w:t xml:space="preserve">Dockerfile / Containerization config (if applicable) </w:t>
+            <w:proofErr w:type="spellStart"/>
+            <w:r>
+              <w:rPr>
+                <w:rFonts w:ascii="Arial" w:eastAsia="Arial" w:hAnsi="Arial" w:cs="Arial"/>
+                <w:sz w:val="24"/>
+              </w:rPr>
+              <w:t>Dockerfile</w:t>
+            </w:r>
+            <w:proofErr w:type="spellEnd"/>
+            <w:r>
+              <w:rPr>
+                <w:rFonts w:ascii="Arial" w:eastAsia="Arial" w:hAnsi="Arial" w:cs="Arial"/>
+                <w:sz w:val="24"/>
+              </w:rPr>
+              <w:t xml:space="preserve"> / Containerization config (if applicable) </w:t>
             </w:r>
             <w:r>
               <w:t xml:space="preserve"> </w:t>
@@ -1927,7 +2020,15 @@
                 <w:b/>
                 <w:sz w:val="24"/>
               </w:rPr>
-              <w:t xml:space="preserve">Login  Credentials </w:t>
+              <w:t>Login Credentials</w:t>
+            </w:r>
+            <w:r>
+              <w:rPr>
+                <w:rFonts w:ascii="Arial" w:eastAsia="Arial" w:hAnsi="Arial" w:cs="Arial"/>
+                <w:b/>
+                <w:sz w:val="24"/>
+              </w:rPr>
+              <w:t xml:space="preserve"> </w:t>
             </w:r>
           </w:p>
           <w:p>
@@ -2052,7 +2153,23 @@
                 <w:rFonts w:ascii="Arial" w:eastAsia="Arial" w:hAnsi="Arial" w:cs="Arial"/>
                 <w:sz w:val="24"/>
               </w:rPr>
-              <w:t xml:space="preserve">[e.g., Render, Vercel, AWS, Heroku, Azure] </w:t>
+              <w:t xml:space="preserve">[e.g., Render, </w:t>
+            </w:r>
+            <w:proofErr w:type="spellStart"/>
+            <w:r>
+              <w:rPr>
+                <w:rFonts w:ascii="Arial" w:eastAsia="Arial" w:hAnsi="Arial" w:cs="Arial"/>
+                <w:sz w:val="24"/>
+              </w:rPr>
+              <w:t>Vercel</w:t>
+            </w:r>
+            <w:proofErr w:type="spellEnd"/>
+            <w:r>
+              <w:rPr>
+                <w:rFonts w:ascii="Arial" w:eastAsia="Arial" w:hAnsi="Arial" w:cs="Arial"/>
+                <w:sz w:val="24"/>
+              </w:rPr>
+              <w:t xml:space="preserve">, AWS, Heroku, Azure] </w:t>
             </w:r>
             <w:r>
               <w:t xml:space="preserve"> </w:t>
@@ -2111,6 +2228,9 @@
             </w:r>
             <w:r>
               <w:t xml:space="preserve"> </w:t>
+            </w:r>
+            <w:r>
+              <w:t>https://github.com/Hari-06-Prakash/OptiCrop-Project-Submission</w:t>
             </w:r>
           </w:p>
         </w:tc>
@@ -2239,7 +2359,23 @@
           <w:rFonts w:ascii="Times New Roman" w:eastAsia="Times New Roman" w:hAnsi="Times New Roman" w:cs="Times New Roman"/>
           <w:sz w:val="24"/>
         </w:rPr>
-        <w:t xml:space="preserve"> Python 3.x, pip, Anaconda Navigator (recommended) or virtualenv </w:t>
+        <w:t xml:space="preserve"> Python 3.x, pip, Anaconda Navigator (recommended) or </w:t>
+      </w:r>
+      <w:proofErr w:type="spellStart"/>
+      <w:r>
+        <w:rPr>
+          <w:rFonts w:ascii="Times New Roman" w:eastAsia="Times New Roman" w:hAnsi="Times New Roman" w:cs="Times New Roman"/>
+          <w:sz w:val="24"/>
+        </w:rPr>
+        <w:t>virtualenv</w:t>
+      </w:r>
+      <w:proofErr w:type="spellEnd"/>
+      <w:r>
+        <w:rPr>
+          <w:rFonts w:ascii="Times New Roman" w:eastAsia="Times New Roman" w:hAnsi="Times New Roman" w:cs="Times New Roman"/>
+          <w:sz w:val="24"/>
+        </w:rPr>
+        <w:t xml:space="preserve"> </w:t>
       </w:r>
     </w:p>
     <w:p>
@@ -2256,7 +2392,23 @@
           <w:rFonts w:ascii="Times New Roman" w:eastAsia="Times New Roman" w:hAnsi="Times New Roman" w:cs="Times New Roman"/>
           <w:sz w:val="24"/>
         </w:rPr>
-        <w:t xml:space="preserve">Clone the repository: git clone &lt;repository-url&gt; </w:t>
+        <w:t>Clone the repository: git clone &lt;repository-</w:t>
+      </w:r>
+      <w:proofErr w:type="spellStart"/>
+      <w:r>
+        <w:rPr>
+          <w:rFonts w:ascii="Times New Roman" w:eastAsia="Times New Roman" w:hAnsi="Times New Roman" w:cs="Times New Roman"/>
+          <w:sz w:val="24"/>
+        </w:rPr>
+        <w:t>url</w:t>
+      </w:r>
+      <w:proofErr w:type="spellEnd"/>
+      <w:r>
+        <w:rPr>
+          <w:rFonts w:ascii="Times New Roman" w:eastAsia="Times New Roman" w:hAnsi="Times New Roman" w:cs="Times New Roman"/>
+          <w:sz w:val="24"/>
+        </w:rPr>
+        <w:t xml:space="preserve">&gt; </w:t>
       </w:r>
     </w:p>
     <w:p>
@@ -2273,7 +2425,23 @@
           <w:rFonts w:ascii="Times New Roman" w:eastAsia="Times New Roman" w:hAnsi="Times New Roman" w:cs="Times New Roman"/>
           <w:sz w:val="24"/>
         </w:rPr>
-        <w:t xml:space="preserve">Navigate to the project folder: cd OptiCrop </w:t>
+        <w:t xml:space="preserve">Navigate to the project folder: cd </w:t>
+      </w:r>
+      <w:proofErr w:type="spellStart"/>
+      <w:r>
+        <w:rPr>
+          <w:rFonts w:ascii="Times New Roman" w:eastAsia="Times New Roman" w:hAnsi="Times New Roman" w:cs="Times New Roman"/>
+          <w:sz w:val="24"/>
+        </w:rPr>
+        <w:t>OptiCrop</w:t>
+      </w:r>
+      <w:proofErr w:type="spellEnd"/>
+      <w:r>
+        <w:rPr>
+          <w:rFonts w:ascii="Times New Roman" w:eastAsia="Times New Roman" w:hAnsi="Times New Roman" w:cs="Times New Roman"/>
+          <w:sz w:val="24"/>
+        </w:rPr>
+        <w:t xml:space="preserve"> </w:t>
       </w:r>
     </w:p>
     <w:p>
@@ -2307,7 +2475,23 @@
           <w:rFonts w:ascii="Times New Roman" w:eastAsia="Times New Roman" w:hAnsi="Times New Roman" w:cs="Times New Roman"/>
           <w:sz w:val="24"/>
         </w:rPr>
-        <w:t xml:space="preserve">Ensure model.pkl is present in the /model folder </w:t>
+        <w:t xml:space="preserve">Ensure </w:t>
+      </w:r>
+      <w:proofErr w:type="spellStart"/>
+      <w:r>
+        <w:rPr>
+          <w:rFonts w:ascii="Times New Roman" w:eastAsia="Times New Roman" w:hAnsi="Times New Roman" w:cs="Times New Roman"/>
+          <w:sz w:val="24"/>
+        </w:rPr>
+        <w:t>model.pkl</w:t>
+      </w:r>
+      <w:proofErr w:type="spellEnd"/>
+      <w:r>
+        <w:rPr>
+          <w:rFonts w:ascii="Times New Roman" w:eastAsia="Times New Roman" w:hAnsi="Times New Roman" w:cs="Times New Roman"/>
+          <w:sz w:val="24"/>
+        </w:rPr>
+        <w:t xml:space="preserve"> is present in the /model folder </w:t>
       </w:r>
     </w:p>
     <w:p>
@@ -2413,13 +2597,23 @@
                 <w:sz w:val="24"/>
               </w:rPr>
             </w:pPr>
+            <w:proofErr w:type="spellStart"/>
             <w:r>
               <w:rPr>
                 <w:rFonts w:ascii="Arial" w:eastAsia="Arial" w:hAnsi="Arial" w:cs="Arial"/>
                 <w:b/>
                 <w:sz w:val="24"/>
               </w:rPr>
-              <w:t xml:space="preserve">S.No </w:t>
+              <w:t>S.No</w:t>
+            </w:r>
+            <w:proofErr w:type="spellEnd"/>
+            <w:r>
+              <w:rPr>
+                <w:rFonts w:ascii="Arial" w:eastAsia="Arial" w:hAnsi="Arial" w:cs="Arial"/>
+                <w:b/>
+                <w:sz w:val="24"/>
+              </w:rPr>
+              <w:t xml:space="preserve"> </w:t>
             </w:r>
             <w:r>
               <w:t xml:space="preserve"> </w:t>
@@ -2572,7 +2766,23 @@
                 <w:rFonts w:ascii="Times New Roman" w:eastAsia="Times New Roman" w:hAnsi="Times New Roman" w:cs="Times New Roman"/>
                 <w:sz w:val="24"/>
               </w:rPr>
-              <w:t xml:space="preserve">Plan to deploy using Gunicorn + Nginx or a cloud platform </w:t>
+              <w:t xml:space="preserve">Plan to deploy using </w:t>
+            </w:r>
+            <w:proofErr w:type="spellStart"/>
+            <w:r>
+              <w:rPr>
+                <w:rFonts w:ascii="Times New Roman" w:eastAsia="Times New Roman" w:hAnsi="Times New Roman" w:cs="Times New Roman"/>
+                <w:sz w:val="24"/>
+              </w:rPr>
+              <w:t>Gunicorn</w:t>
+            </w:r>
+            <w:proofErr w:type="spellEnd"/>
+            <w:r>
+              <w:rPr>
+                <w:rFonts w:ascii="Times New Roman" w:eastAsia="Times New Roman" w:hAnsi="Times New Roman" w:cs="Times New Roman"/>
+                <w:sz w:val="24"/>
+              </w:rPr>
+              <w:t xml:space="preserve"> + Nginx or a cloud platform </w:t>
             </w:r>
           </w:p>
           <w:p>
@@ -2722,7 +2932,23 @@
                 <w:rFonts w:ascii="Times New Roman" w:eastAsia="Times New Roman" w:hAnsi="Times New Roman" w:cs="Times New Roman"/>
                 <w:sz w:val="24"/>
               </w:rPr>
-              <w:t xml:space="preserve"> Model trained on a fixed dataset; does not autoupdate with new agricultural data</w:t>
+              <w:t xml:space="preserve"> Model trained on a fixed dataset; does not </w:t>
+            </w:r>
+            <w:proofErr w:type="spellStart"/>
+            <w:r>
+              <w:rPr>
+                <w:rFonts w:ascii="Times New Roman" w:eastAsia="Times New Roman" w:hAnsi="Times New Roman" w:cs="Times New Roman"/>
+                <w:sz w:val="24"/>
+              </w:rPr>
+              <w:t>autoupdate</w:t>
+            </w:r>
+            <w:proofErr w:type="spellEnd"/>
+            <w:r>
+              <w:rPr>
+                <w:rFonts w:ascii="Times New Roman" w:eastAsia="Times New Roman" w:hAnsi="Times New Roman" w:cs="Times New Roman"/>
+                <w:sz w:val="24"/>
+              </w:rPr>
+              <w:t xml:space="preserve"> with new agricultural data</w:t>
             </w:r>
             <w:r>
               <w:t xml:space="preserve"> </w:t>

</xml_diff>

<commit_message>
Update Project Executable Files document
</commit_message>
<xml_diff>
--- a/7. Project Documentation/Project Executable Files.docx
+++ b/7. Project Documentation/Project Executable Files.docx
@@ -237,19 +237,11 @@
             <w:pPr>
               <w:ind w:left="14"/>
             </w:pPr>
-            <w:proofErr w:type="spellStart"/>
             <w:r>
               <w:rPr>
                 <w:rFonts w:ascii="Times New Roman" w:eastAsia="Times New Roman" w:hAnsi="Times New Roman" w:cs="Times New Roman"/>
               </w:rPr>
-              <w:t>OptiCrop</w:t>
-            </w:r>
-            <w:proofErr w:type="spellEnd"/>
-            <w:r>
-              <w:rPr>
-                <w:rFonts w:ascii="Times New Roman" w:eastAsia="Times New Roman" w:hAnsi="Times New Roman" w:cs="Times New Roman"/>
-              </w:rPr>
-              <w:t xml:space="preserve">: Smart Agricultural Production Optimization Engine </w:t>
+              <w:t xml:space="preserve">OptiCrop: Smart Agricultural Production Optimization Engine </w:t>
             </w:r>
           </w:p>
         </w:tc>
@@ -366,25 +358,7 @@
           <w:sz w:val="44"/>
           <w:szCs w:val="44"/>
         </w:rPr>
-        <w:t xml:space="preserve">This section requires submission of all executable and deployable files for your project. Ensure all files are properly organized, named, and uploaded to the specified submission </w:t>
-      </w:r>
-      <w:proofErr w:type="spellStart"/>
-      <w:r>
-        <w:rPr>
-          <w:rFonts w:ascii="Arial" w:eastAsia="Arial" w:hAnsi="Arial" w:cs="Arial"/>
-          <w:sz w:val="44"/>
-          <w:szCs w:val="44"/>
-        </w:rPr>
-        <w:t>platform.The</w:t>
-      </w:r>
-      <w:proofErr w:type="spellEnd"/>
-      <w:r>
-        <w:rPr>
-          <w:rFonts w:ascii="Arial" w:eastAsia="Arial" w:hAnsi="Arial" w:cs="Arial"/>
-          <w:sz w:val="44"/>
-          <w:szCs w:val="44"/>
-        </w:rPr>
-        <w:t xml:space="preserve"> evaluator must be able to run or deploy your solution using the provided files and instructions. </w:t>
+        <w:t xml:space="preserve">This section requires submission of all executable and deployable files for your project. Ensure all files are properly organized, named, and uploaded to the specified submission platform.The evaluator must be able to run or deploy your solution using the provided files and instructions. </w:t>
       </w:r>
       <w:r>
         <w:rPr>
@@ -453,23 +427,13 @@
             <w:pPr>
               <w:ind w:left="137"/>
             </w:pPr>
-            <w:proofErr w:type="spellStart"/>
             <w:r>
               <w:rPr>
                 <w:rFonts w:ascii="Arial" w:eastAsia="Arial" w:hAnsi="Arial" w:cs="Arial"/>
                 <w:b/>
                 <w:sz w:val="24"/>
               </w:rPr>
-              <w:t>S.No</w:t>
-            </w:r>
-            <w:proofErr w:type="spellEnd"/>
-            <w:r>
-              <w:rPr>
-                <w:rFonts w:ascii="Arial" w:eastAsia="Arial" w:hAnsi="Arial" w:cs="Arial"/>
-                <w:b/>
-                <w:sz w:val="24"/>
-              </w:rPr>
-              <w:t xml:space="preserve"> </w:t>
+              <w:t xml:space="preserve">S.No </w:t>
             </w:r>
             <w:r>
               <w:t xml:space="preserve"> </w:t>
@@ -852,23 +816,7 @@
                 <w:rFonts w:ascii="Arial" w:eastAsia="Arial" w:hAnsi="Arial" w:cs="Arial"/>
                 <w:sz w:val="24"/>
               </w:rPr>
-              <w:t xml:space="preserve">requirements.txt / </w:t>
-            </w:r>
-            <w:proofErr w:type="spellStart"/>
-            <w:r>
-              <w:rPr>
-                <w:rFonts w:ascii="Arial" w:eastAsia="Arial" w:hAnsi="Arial" w:cs="Arial"/>
-                <w:sz w:val="24"/>
-              </w:rPr>
-              <w:t>package.json</w:t>
-            </w:r>
-            <w:proofErr w:type="spellEnd"/>
-            <w:r>
-              <w:rPr>
-                <w:rFonts w:ascii="Arial" w:eastAsia="Arial" w:hAnsi="Arial" w:cs="Arial"/>
-                <w:sz w:val="24"/>
-              </w:rPr>
-              <w:t xml:space="preserve"> / dependency file </w:t>
+              <w:t xml:space="preserve">requirements.txt / package.json / dependency file </w:t>
             </w:r>
             <w:r>
               <w:t xml:space="preserve"> </w:t>
@@ -1051,23 +999,7 @@
                 <w:rFonts w:ascii="Times New Roman" w:eastAsia="Times New Roman" w:hAnsi="Times New Roman" w:cs="Times New Roman"/>
                 <w:sz w:val="24"/>
               </w:rPr>
-              <w:t xml:space="preserve">database used; CSV dataset + </w:t>
-            </w:r>
-            <w:proofErr w:type="spellStart"/>
-            <w:r>
-              <w:rPr>
-                <w:rFonts w:ascii="Times New Roman" w:eastAsia="Times New Roman" w:hAnsi="Times New Roman" w:cs="Times New Roman"/>
-                <w:sz w:val="24"/>
-              </w:rPr>
-              <w:t>model.pkl</w:t>
-            </w:r>
-            <w:proofErr w:type="spellEnd"/>
-            <w:r>
-              <w:rPr>
-                <w:rFonts w:ascii="Times New Roman" w:eastAsia="Times New Roman" w:hAnsi="Times New Roman" w:cs="Times New Roman"/>
-                <w:sz w:val="24"/>
-              </w:rPr>
-              <w:t xml:space="preserve"> file storage instead</w:t>
+              <w:t>database used; CSV dataset + model.pkl file storage instead</w:t>
             </w:r>
             <w:r>
               <w:t xml:space="preserve"> </w:t>
@@ -1142,23 +1074,7 @@
                 <w:rFonts w:ascii="Arial" w:eastAsia="Arial" w:hAnsi="Arial" w:cs="Arial"/>
                 <w:sz w:val="24"/>
               </w:rPr>
-              <w:t>Environment  configuration file (.</w:t>
-            </w:r>
-            <w:proofErr w:type="spellStart"/>
-            <w:r>
-              <w:rPr>
-                <w:rFonts w:ascii="Arial" w:eastAsia="Arial" w:hAnsi="Arial" w:cs="Arial"/>
-                <w:sz w:val="24"/>
-              </w:rPr>
-              <w:t>env.example</w:t>
-            </w:r>
-            <w:proofErr w:type="spellEnd"/>
-            <w:r>
-              <w:rPr>
-                <w:rFonts w:ascii="Arial" w:eastAsia="Arial" w:hAnsi="Arial" w:cs="Arial"/>
-                <w:sz w:val="24"/>
-              </w:rPr>
-              <w:t xml:space="preserve"> similar) </w:t>
+              <w:t xml:space="preserve">Environment  configuration file (.env.example similar) </w:t>
             </w:r>
             <w:r>
               <w:t xml:space="preserve"> </w:t>
@@ -1512,21 +1428,12 @@
                 <w:sz w:val="24"/>
               </w:rPr>
             </w:pPr>
-            <w:proofErr w:type="spellStart"/>
-            <w:r>
-              <w:rPr>
-                <w:rFonts w:ascii="Arial" w:eastAsia="Arial" w:hAnsi="Arial" w:cs="Arial"/>
-                <w:sz w:val="24"/>
-              </w:rPr>
-              <w:t>Dockerfile</w:t>
-            </w:r>
-            <w:proofErr w:type="spellEnd"/>
-            <w:r>
-              <w:rPr>
-                <w:rFonts w:ascii="Arial" w:eastAsia="Arial" w:hAnsi="Arial" w:cs="Arial"/>
-                <w:sz w:val="24"/>
-              </w:rPr>
-              <w:t xml:space="preserve"> / Containerization config (if applicable) </w:t>
+            <w:r>
+              <w:rPr>
+                <w:rFonts w:ascii="Arial" w:eastAsia="Arial" w:hAnsi="Arial" w:cs="Arial"/>
+                <w:sz w:val="24"/>
+              </w:rPr>
+              <w:t xml:space="preserve">Dockerfile / Containerization config (if applicable) </w:t>
             </w:r>
             <w:r>
               <w:t xml:space="preserve"> </w:t>
@@ -1989,6 +1896,9 @@
             <w:r>
               <w:t xml:space="preserve"> </w:t>
             </w:r>
+            <w:r>
+              <w:t>https://opticrop-vttp.onrender.com/</w:t>
+            </w:r>
           </w:p>
         </w:tc>
       </w:tr>
@@ -2153,23 +2063,7 @@
                 <w:rFonts w:ascii="Arial" w:eastAsia="Arial" w:hAnsi="Arial" w:cs="Arial"/>
                 <w:sz w:val="24"/>
               </w:rPr>
-              <w:t xml:space="preserve">[e.g., Render, </w:t>
-            </w:r>
-            <w:proofErr w:type="spellStart"/>
-            <w:r>
-              <w:rPr>
-                <w:rFonts w:ascii="Arial" w:eastAsia="Arial" w:hAnsi="Arial" w:cs="Arial"/>
-                <w:sz w:val="24"/>
-              </w:rPr>
-              <w:t>Vercel</w:t>
-            </w:r>
-            <w:proofErr w:type="spellEnd"/>
-            <w:r>
-              <w:rPr>
-                <w:rFonts w:ascii="Arial" w:eastAsia="Arial" w:hAnsi="Arial" w:cs="Arial"/>
-                <w:sz w:val="24"/>
-              </w:rPr>
-              <w:t xml:space="preserve">, AWS, Heroku, Azure] </w:t>
+              <w:t xml:space="preserve">[e.g., Render, Vercel, AWS, Heroku, Azure] </w:t>
             </w:r>
             <w:r>
               <w:t xml:space="preserve"> </w:t>
@@ -2359,23 +2253,7 @@
           <w:rFonts w:ascii="Times New Roman" w:eastAsia="Times New Roman" w:hAnsi="Times New Roman" w:cs="Times New Roman"/>
           <w:sz w:val="24"/>
         </w:rPr>
-        <w:t xml:space="preserve"> Python 3.x, pip, Anaconda Navigator (recommended) or </w:t>
-      </w:r>
-      <w:proofErr w:type="spellStart"/>
-      <w:r>
-        <w:rPr>
-          <w:rFonts w:ascii="Times New Roman" w:eastAsia="Times New Roman" w:hAnsi="Times New Roman" w:cs="Times New Roman"/>
-          <w:sz w:val="24"/>
-        </w:rPr>
-        <w:t>virtualenv</w:t>
-      </w:r>
-      <w:proofErr w:type="spellEnd"/>
-      <w:r>
-        <w:rPr>
-          <w:rFonts w:ascii="Times New Roman" w:eastAsia="Times New Roman" w:hAnsi="Times New Roman" w:cs="Times New Roman"/>
-          <w:sz w:val="24"/>
-        </w:rPr>
-        <w:t xml:space="preserve"> </w:t>
+        <w:t xml:space="preserve"> Python 3.x, pip, Anaconda Navigator (recommended) or virtualenv </w:t>
       </w:r>
     </w:p>
     <w:p>
@@ -2392,23 +2270,7 @@
           <w:rFonts w:ascii="Times New Roman" w:eastAsia="Times New Roman" w:hAnsi="Times New Roman" w:cs="Times New Roman"/>
           <w:sz w:val="24"/>
         </w:rPr>
-        <w:t>Clone the repository: git clone &lt;repository-</w:t>
-      </w:r>
-      <w:proofErr w:type="spellStart"/>
-      <w:r>
-        <w:rPr>
-          <w:rFonts w:ascii="Times New Roman" w:eastAsia="Times New Roman" w:hAnsi="Times New Roman" w:cs="Times New Roman"/>
-          <w:sz w:val="24"/>
-        </w:rPr>
-        <w:t>url</w:t>
-      </w:r>
-      <w:proofErr w:type="spellEnd"/>
-      <w:r>
-        <w:rPr>
-          <w:rFonts w:ascii="Times New Roman" w:eastAsia="Times New Roman" w:hAnsi="Times New Roman" w:cs="Times New Roman"/>
-          <w:sz w:val="24"/>
-        </w:rPr>
-        <w:t xml:space="preserve">&gt; </w:t>
+        <w:t xml:space="preserve">Clone the repository: git clone &lt;repository-url&gt; </w:t>
       </w:r>
     </w:p>
     <w:p>
@@ -2425,23 +2287,7 @@
           <w:rFonts w:ascii="Times New Roman" w:eastAsia="Times New Roman" w:hAnsi="Times New Roman" w:cs="Times New Roman"/>
           <w:sz w:val="24"/>
         </w:rPr>
-        <w:t xml:space="preserve">Navigate to the project folder: cd </w:t>
-      </w:r>
-      <w:proofErr w:type="spellStart"/>
-      <w:r>
-        <w:rPr>
-          <w:rFonts w:ascii="Times New Roman" w:eastAsia="Times New Roman" w:hAnsi="Times New Roman" w:cs="Times New Roman"/>
-          <w:sz w:val="24"/>
-        </w:rPr>
-        <w:t>OptiCrop</w:t>
-      </w:r>
-      <w:proofErr w:type="spellEnd"/>
-      <w:r>
-        <w:rPr>
-          <w:rFonts w:ascii="Times New Roman" w:eastAsia="Times New Roman" w:hAnsi="Times New Roman" w:cs="Times New Roman"/>
-          <w:sz w:val="24"/>
-        </w:rPr>
-        <w:t xml:space="preserve"> </w:t>
+        <w:t xml:space="preserve">Navigate to the project folder: cd OptiCrop </w:t>
       </w:r>
     </w:p>
     <w:p>
@@ -2475,23 +2321,7 @@
           <w:rFonts w:ascii="Times New Roman" w:eastAsia="Times New Roman" w:hAnsi="Times New Roman" w:cs="Times New Roman"/>
           <w:sz w:val="24"/>
         </w:rPr>
-        <w:t xml:space="preserve">Ensure </w:t>
-      </w:r>
-      <w:proofErr w:type="spellStart"/>
-      <w:r>
-        <w:rPr>
-          <w:rFonts w:ascii="Times New Roman" w:eastAsia="Times New Roman" w:hAnsi="Times New Roman" w:cs="Times New Roman"/>
-          <w:sz w:val="24"/>
-        </w:rPr>
-        <w:t>model.pkl</w:t>
-      </w:r>
-      <w:proofErr w:type="spellEnd"/>
-      <w:r>
-        <w:rPr>
-          <w:rFonts w:ascii="Times New Roman" w:eastAsia="Times New Roman" w:hAnsi="Times New Roman" w:cs="Times New Roman"/>
-          <w:sz w:val="24"/>
-        </w:rPr>
-        <w:t xml:space="preserve"> is present in the /model folder </w:t>
+        <w:t xml:space="preserve">Ensure model.pkl is present in the /model folder </w:t>
       </w:r>
     </w:p>
     <w:p>
@@ -2597,23 +2427,13 @@
                 <w:sz w:val="24"/>
               </w:rPr>
             </w:pPr>
-            <w:proofErr w:type="spellStart"/>
             <w:r>
               <w:rPr>
                 <w:rFonts w:ascii="Arial" w:eastAsia="Arial" w:hAnsi="Arial" w:cs="Arial"/>
                 <w:b/>
                 <w:sz w:val="24"/>
               </w:rPr>
-              <w:t>S.No</w:t>
-            </w:r>
-            <w:proofErr w:type="spellEnd"/>
-            <w:r>
-              <w:rPr>
-                <w:rFonts w:ascii="Arial" w:eastAsia="Arial" w:hAnsi="Arial" w:cs="Arial"/>
-                <w:b/>
-                <w:sz w:val="24"/>
-              </w:rPr>
-              <w:t xml:space="preserve"> </w:t>
+              <w:t xml:space="preserve">S.No </w:t>
             </w:r>
             <w:r>
               <w:t xml:space="preserve"> </w:t>
@@ -2766,23 +2586,7 @@
                 <w:rFonts w:ascii="Times New Roman" w:eastAsia="Times New Roman" w:hAnsi="Times New Roman" w:cs="Times New Roman"/>
                 <w:sz w:val="24"/>
               </w:rPr>
-              <w:t xml:space="preserve">Plan to deploy using </w:t>
-            </w:r>
-            <w:proofErr w:type="spellStart"/>
-            <w:r>
-              <w:rPr>
-                <w:rFonts w:ascii="Times New Roman" w:eastAsia="Times New Roman" w:hAnsi="Times New Roman" w:cs="Times New Roman"/>
-                <w:sz w:val="24"/>
-              </w:rPr>
-              <w:t>Gunicorn</w:t>
-            </w:r>
-            <w:proofErr w:type="spellEnd"/>
-            <w:r>
-              <w:rPr>
-                <w:rFonts w:ascii="Times New Roman" w:eastAsia="Times New Roman" w:hAnsi="Times New Roman" w:cs="Times New Roman"/>
-                <w:sz w:val="24"/>
-              </w:rPr>
-              <w:t xml:space="preserve"> + Nginx or a cloud platform </w:t>
+              <w:t xml:space="preserve">Plan to deploy using Gunicorn + Nginx or a cloud platform </w:t>
             </w:r>
           </w:p>
           <w:p>
@@ -2932,23 +2736,7 @@
                 <w:rFonts w:ascii="Times New Roman" w:eastAsia="Times New Roman" w:hAnsi="Times New Roman" w:cs="Times New Roman"/>
                 <w:sz w:val="24"/>
               </w:rPr>
-              <w:t xml:space="preserve"> Model trained on a fixed dataset; does not </w:t>
-            </w:r>
-            <w:proofErr w:type="spellStart"/>
-            <w:r>
-              <w:rPr>
-                <w:rFonts w:ascii="Times New Roman" w:eastAsia="Times New Roman" w:hAnsi="Times New Roman" w:cs="Times New Roman"/>
-                <w:sz w:val="24"/>
-              </w:rPr>
-              <w:t>autoupdate</w:t>
-            </w:r>
-            <w:proofErr w:type="spellEnd"/>
-            <w:r>
-              <w:rPr>
-                <w:rFonts w:ascii="Times New Roman" w:eastAsia="Times New Roman" w:hAnsi="Times New Roman" w:cs="Times New Roman"/>
-                <w:sz w:val="24"/>
-              </w:rPr>
-              <w:t xml:space="preserve"> with new agricultural data</w:t>
+              <w:t xml:space="preserve"> Model trained on a fixed dataset; does not autoupdate with new agricultural data</w:t>
             </w:r>
             <w:r>
               <w:t xml:space="preserve"> </w:t>

</xml_diff>